<commit_message>
chore: generate 31 chord sheet DOCXs from templates, remove 8 duplicate covers (FR-20260426-chord-sheets-from-templates)
</commit_message>
<xml_diff>
--- a/catalog/sheet_music/originals/Fly Away_Tyler James Drake_Key_C.docx
+++ b/catalog/sheet_music/originals/Fly Away_Tyler James Drake_Key_C.docx
@@ -1633,23 +1633,11 @@
       <w:r>
         <w:rPr>
           <w:rFonts w:ascii="Courier New" w:hAnsi="Courier New"/>
+          <w:b/>
+          <w:color w:val="C87828"/>
           <w:sz w:val="20"/>
         </w:rPr>
-        <w:t>|</w:t>
-      </w:r>
-      <w:r>
-        <w:rPr>
-          <w:rFonts w:ascii="Courier New" w:hAnsi="Courier New"/>
-          <w:sz w:val="20"/>
-        </w:rPr>
-        <w:t xml:space="preserve"> </w:t>
-      </w:r>
-      <w:r>
-        <w:rPr>
-          <w:rFonts w:ascii="Courier New" w:hAnsi="Courier New"/>
-          <w:sz w:val="20"/>
-        </w:rPr>
-        <w:t>|</w:t>
+        <w:t xml:space="preserve"> || </w:t>
       </w:r>
       <w:r>
         <w:rPr>
@@ -1774,7 +1762,23 @@
           <w:rFonts w:ascii="Arial Black" w:hAnsi="Arial Black"/>
           <w:sz w:val="20"/>
         </w:rPr>
-        <w:t>Am I the one in between?    Wanna be the one you always need.</w:t>
+        <w:t xml:space="preserve">Am I the one in between?   </w:t>
+      </w:r>
+      <w:r>
+        <w:rPr>
+          <w:rFonts w:ascii="Arial Black" w:hAnsi="Arial Black"/>
+          <w:i/>
+          <w:color w:val="C87828"/>
+          <w:sz w:val="20"/>
+        </w:rPr>
+        <w:t xml:space="preserve"> ‖ </w:t>
+      </w:r>
+      <w:r>
+        <w:rPr>
+          <w:rFonts w:ascii="Arial Black" w:hAnsi="Arial Black"/>
+          <w:sz w:val="20"/>
+        </w:rPr>
+        <w:t xml:space="preserve"> Wanna be the one you always need.</w:t>
       </w:r>
     </w:p>
     <w:p>
@@ -1887,27 +1891,17 @@
         </w:rPr>
         <w:t>|</w:t>
       </w:r>
-      <w:r>
-        <w:rPr>
-          <w:rFonts w:ascii="Courier New" w:hAnsi="Courier New"/>
+    </w:p>
+    <w:p>
+      <w:r>
+        <w:rPr>
+          <w:rFonts w:ascii="Arial Black" w:hAnsi="Arial Black"/>
           <w:sz w:val="20"/>
         </w:rPr>
-        <w:t xml:space="preserve"> </w:t>
-      </w:r>
-      <w:r>
-        <w:rPr>
-          <w:rFonts w:ascii="Courier New" w:hAnsi="Courier New"/>
-          <w:sz w:val="20"/>
-        </w:rPr>
-        <w:t>|</w:t>
-      </w:r>
-      <w:r>
-        <w:rPr>
-          <w:rFonts w:ascii="Courier New" w:hAnsi="Courier New"/>
-          <w:sz w:val="20"/>
-        </w:rPr>
-        <w:t xml:space="preserve"> </w:t>
-      </w:r>
+        <w:t>Am I the one who lives in your dreams?</w:t>
+      </w:r>
+    </w:p>
+    <w:p>
       <w:r>
         <w:rPr>
           <w:rFonts w:ascii="Courier New" w:hAnsi="Courier New"/>
@@ -2024,7 +2018,7 @@
           <w:rFonts w:ascii="Arial Black" w:hAnsi="Arial Black"/>
           <w:sz w:val="20"/>
         </w:rPr>
-        <w:t>Am I the one who lives in your dreams?  Clearly written in your memory.</w:t>
+        <w:t>Clearly written in your memory.</w:t>
       </w:r>
     </w:p>
     <w:p>
@@ -2048,8 +2042,26 @@
         </w:rPr>
         <w:t>Same as PRE-CHORUS 1 (see above)</w:t>
       </w:r>
+      <w:r>
+        <w:rPr>
+          <w:color w:val="6E6E6E"/>
+          <w:sz w:val="18"/>
+        </w:rPr>
+        <w:t xml:space="preserve">  —  </w:t>
+      </w:r>
+      <w:r>
+        <w:rPr>
+          <w:rFonts w:ascii="Courier New" w:hAnsi="Courier New"/>
+          <w:color w:val="6E6E6E"/>
+          <w:sz w:val="18"/>
+        </w:rPr>
+        <w:t>Dm | Dm | Am | Am |  ·  F | G7 | Dm | Dm |</w:t>
+      </w:r>
     </w:p>
     <w:p>
+      <w:pPr>
+        <w:spacing w:before="40"/>
+      </w:pPr>
       <w:r>
         <w:rPr>
           <w:i/>
@@ -2071,27 +2083,43 @@
         </w:rPr>
         <w:t>★ CHORUS 2</w:t>
       </w:r>
+      <w:r>
+        <w:rPr>
+          <w:i/>
+          <w:color w:val="7850A0"/>
+          <w:sz w:val="18"/>
+        </w:rPr>
+        <w:t xml:space="preserve">  x2</w:t>
+      </w:r>
     </w:p>
     <w:p>
       <w:r>
         <w:rPr>
           <w:i/>
+          <w:sz w:val="20"/>
+        </w:rPr>
+        <w:t>Same as CHORUS 1 (see above)</w:t>
+      </w:r>
+      <w:r>
+        <w:rPr>
           <w:color w:val="6E6E6E"/>
           <w:sz w:val="18"/>
         </w:rPr>
-        <w:t>x2</w:t>
+        <w:t xml:space="preserve">  —  </w:t>
+      </w:r>
+      <w:r>
+        <w:rPr>
+          <w:rFonts w:ascii="Courier New" w:hAnsi="Courier New"/>
+          <w:color w:val="6E6E6E"/>
+          <w:sz w:val="18"/>
+        </w:rPr>
+        <w:t>F | Am | G | E7 | F | Am | G | E7 |  ·  F | Am | G | E7 | F | Am | G | G |</w:t>
       </w:r>
     </w:p>
     <w:p>
-      <w:r>
-        <w:rPr>
-          <w:i/>
-          <w:sz w:val="20"/>
-        </w:rPr>
-        <w:t>Same as CHORUS 1 (see above)</w:t>
-      </w:r>
-    </w:p>
-    <w:p>
+      <w:pPr>
+        <w:spacing w:before="40"/>
+      </w:pPr>
       <w:r>
         <w:rPr>
           <w:i/>

</xml_diff>